<commit_message>
Docs: two more Word documents, and two corrections to the guide
FETCH-Update-11-October-2026.docx: what was fixed after the QA test and
how each fix was checked, the forecast before and after, what was not
fixed and why, what is waiting for a decision, and every commit in order.

FETCH-Analytics-Explanation-and-Computation.docx: each step of the
forecast explained and then worked through with numbers: the cap, a new
product, the simple trend, the 12 inputs and the two models, the
correction, confidence, stock decisions and the error measures. The worked
examples use made-up histories run through the system's own code, and each
step shown was checked to give the code's answer. The real figures come
from the read-only accuracy test.

FETCH-System-and-Analytics-Guide.docx: the copy the Activity log keeps of
a deleted sale is described by what it holds, and the model's "weeks
before" inputs are named as the code counts them.

Co-Authored-By: Claude Opus 5.5 <noreply@anthropic.com>
</commit_message>
<xml_diff>
--- a/QA/FETCH-System-and-Analytics-Guide.docx
+++ b/QA/FETCH-System-and-Analytics-Guide.docx
@@ -2503,7 +2503,7 @@
         <w:rPr>
           <w:rFonts w:ascii="Calibri" w:cs="Calibri" w:eastAsia="Calibri" w:hAnsi="Calibri"/>
         </w:rPr>
-        <w:t xml:space="preserve"> (administrator only): removes a sale. The activity log keeps a full copy of it, items included.</w:t>
+        <w:t xml:space="preserve"> (administrator only): removes a sale. The activity log keeps a copy of it: its number, date, cashier, customer, totals and every item.</w:t>
       </w:r>
     </w:p>
     <w:p>
@@ -7587,35 +7587,35 @@
                 <w:sz w:val="20"/>
                 <w:szCs w:val="20"/>
               </w:rPr>
-              <w:t xml:space="preserve">Sales 7 days before that</w:t>
-            </w:r>
-          </w:p>
-          <w:p>
-            <w:pPr>
-              <w:spacing w:after="40" w:line="260"/>
-            </w:pPr>
-            <w:r>
-              <w:rPr>
-                <w:rFonts w:ascii="Calibri" w:cs="Calibri" w:eastAsia="Calibri" w:hAnsi="Calibri"/>
-                <w:color w:val="1F2937"/>
-                <w:sz w:val="20"/>
-                <w:szCs w:val="20"/>
-              </w:rPr>
-              <w:t xml:space="preserve">Sales 14 days before that</w:t>
-            </w:r>
-          </w:p>
-          <w:p>
-            <w:pPr>
-              <w:spacing w:after="40" w:line="260"/>
-            </w:pPr>
-            <w:r>
-              <w:rPr>
-                <w:rFonts w:ascii="Calibri" w:cs="Calibri" w:eastAsia="Calibri" w:hAnsi="Calibri"/>
-                <w:color w:val="1F2937"/>
-                <w:sz w:val="20"/>
-                <w:szCs w:val="20"/>
-              </w:rPr>
-              <w:t xml:space="preserve">Sales 28 days before that</w:t>
+              <w:t xml:space="preserve">Sales a week before the first day forecast</w:t>
+            </w:r>
+          </w:p>
+          <w:p>
+            <w:pPr>
+              <w:spacing w:after="40" w:line="260"/>
+            </w:pPr>
+            <w:r>
+              <w:rPr>
+                <w:rFonts w:ascii="Calibri" w:cs="Calibri" w:eastAsia="Calibri" w:hAnsi="Calibri"/>
+                <w:color w:val="1F2937"/>
+                <w:sz w:val="20"/>
+                <w:szCs w:val="20"/>
+              </w:rPr>
+              <w:t xml:space="preserve">Sales two weeks before it</w:t>
+            </w:r>
+          </w:p>
+          <w:p>
+            <w:pPr>
+              <w:spacing w:after="40" w:line="260"/>
+            </w:pPr>
+            <w:r>
+              <w:rPr>
+                <w:rFonts w:ascii="Calibri" w:cs="Calibri" w:eastAsia="Calibri" w:hAnsi="Calibri"/>
+                <w:color w:val="1F2937"/>
+                <w:sz w:val="20"/>
+                <w:szCs w:val="20"/>
+              </w:rPr>
+              <w:t xml:space="preserve">Sales four weeks before it</w:t>
             </w:r>
           </w:p>
         </w:tc>

</xml_diff>